<commit_message>
Combine AURA call bases with Secretaría Anexo I template.
Ship one Word file with convocatoria rules plus the fillable research/extension presentation form, and point primary download buttons to it.

Co-authored-by: Cursor <cursoragent@cursor.com>
</commit_message>
<xml_diff>
--- a/instituto-del-agua/documentos/plantillas/plantilla-proyecto-investigacion-extension-AURA-2026.docx
+++ b/instituto-del-agua/documentos/plantillas/plantilla-proyecto-investigacion-extension-AURA-2026.docx
@@ -121,7 +121,7 @@
                 <w:color w:val="FFFFFF"/>
                 <w:sz w:val="18"/>
               </w:rPr>
-              <w:t>Plantilla de presentación de proyectos de investigación y extensión (Anexo I adaptado)</w:t>
+              <w:t>Parte B · Anexo I — Presentación de proyecto de investigación / extensión (plantilla Secretaría de Investigación, adaptada a AURA)</w:t>
             </w:r>
           </w:p>
         </w:tc>
@@ -168,7 +168,39 @@
     </w:tbl>
     <w:p>
       <w:pPr>
-        <w:spacing w:after="160" w:before="200" w:line="240" w:lineRule="auto"/>
+        <w:spacing w:after="80" w:before="280" w:line="240" w:lineRule="auto"/>
+        <w:jc w:val="center"/>
+      </w:pPr>
+      <w:r>
+        <w:rPr>
+          <w:rFonts w:ascii="Arial" w:hAnsi="Arial" w:eastAsia="Arial"/>
+          <w:b/>
+          <w:i w:val="0"/>
+          <w:color w:val="7A1532"/>
+          <w:sz w:val="26"/>
+        </w:rPr>
+        <w:t>ANEXO I · PRESENTACIÓN DE PROYECTO</w:t>
+      </w:r>
+    </w:p>
+    <w:p>
+      <w:pPr>
+        <w:spacing w:after="160" w:before="0" w:line="240" w:lineRule="auto"/>
+        <w:jc w:val="center"/>
+      </w:pPr>
+      <w:r>
+        <w:rPr>
+          <w:rFonts w:ascii="Arial" w:hAnsi="Arial" w:eastAsia="Arial"/>
+          <w:b w:val="0"/>
+          <w:i w:val="0"/>
+          <w:color w:val="5C4F54"/>
+          <w:sz w:val="20"/>
+        </w:rPr>
+        <w:t>Formulario institucional de la Secretaría de Investigación y Vinculación Tecnológica · Convocatoria Plan AURA 2026</w:t>
+      </w:r>
+    </w:p>
+    <w:p>
+      <w:pPr>
+        <w:spacing w:after="200" w:before="0" w:line="240" w:lineRule="auto"/>
         <w:jc w:val="both"/>
       </w:pPr>
       <w:r>
@@ -179,23 +211,7 @@
           <w:color w:val="5C4F54"/>
           <w:sz w:val="18"/>
         </w:rPr>
-        <w:t>INSTRUCCIONES (borrar este párrafo al enviar): Completar todos los campos. Basada en el Anexo I de Presentación de proyectos de investigación (Secretaría de Investigación y Vinculación Tecnológica). Nombre sugerido del archivo: AURA_UA_ApellidoDirector_TituloCorto.docx. Presentación: 15 de septiembre al 2 de octubre de 2026. Consultas: luisjimenez@uccuyo.edu.ar · investigacion@uccuyo.edu.ar</w:t>
-      </w:r>
-    </w:p>
-    <w:p>
-      <w:pPr>
-        <w:spacing w:after="200" w:before="240" w:line="240" w:lineRule="auto"/>
-        <w:jc w:val="center"/>
-      </w:pPr>
-      <w:r>
-        <w:rPr>
-          <w:rFonts w:ascii="Arial" w:hAnsi="Arial" w:eastAsia="Arial"/>
-          <w:b/>
-          <w:i w:val="0"/>
-          <w:color w:val="7A1532"/>
-          <w:sz w:val="24"/>
-        </w:rPr>
-        <w:t>PRESENTACIÓN DE PROYECTO DE INVESTIGACIÓN Y/O EXTENSIÓN</w:t>
+        <w:t>INSTRUCCIONES (borrar este párrafo al enviar): Completar todos los campos. Nombre sugerido del archivo: AURA_UA_ApellidoDirector_TituloCorto.docx. Presentación: 15 de septiembre al 2 de octubre de 2026.</w:t>
       </w:r>
     </w:p>
     <w:p>
@@ -426,7 +442,7 @@
           <w:color w:val="5C4F54"/>
           <w:sz w:val="18"/>
         </w:rPr>
-        <w:t xml:space="preserve">  [según bases de la convocatoria]</w:t>
+        <w:t xml:space="preserve">  [según punto 5 de las bases]</w:t>
       </w:r>
     </w:p>
     <w:p>
@@ -4106,7 +4122,7 @@
           <w:color w:val="5C4F54"/>
           <w:sz w:val="18"/>
         </w:rPr>
-        <w:t>Anexo I adaptado · Convocatoria AURA 2026 · Universidad Católica de Cuyo</w:t>
+        <w:t>Documento combinado · Convocatoria AURA 2026 + Anexo I Secretaría de Investigación · UCCuyo</w:t>
       </w:r>
     </w:p>
     <w:sectPr>

</xml_diff>